<commit_message>
Add GitHub repository link to report
</commit_message>
<xml_diff>
--- a/Protocol_Analysis_with_Wireshark_Report.docx
+++ b/Protocol_Analysis_with_Wireshark_Report.docx
@@ -779,6 +779,35 @@
         </w:drawing>
       </w:r>
     </w:p>
+    <w:p>
+      <w:r>
+        <w:rPr>
+          <w:rFonts w:ascii="Times New Roman" w:hAnsi="Times New Roman"/>
+          <w:b/>
+          <w:sz w:val="24"/>
+        </w:rPr>
+        <w:t>10. GitHub Repository Link</w:t>
+      </w:r>
+    </w:p>
+    <w:p>
+      <w:r>
+        <w:rPr>
+          <w:rFonts w:ascii="Times New Roman" w:hAnsi="Times New Roman"/>
+          <w:sz w:val="22"/>
+        </w:rPr>
+        <w:t>The project report, Wireshark packet capture file (.pcapng), and screenshots are available on GitHub at:</w:t>
+        <w:br/>
+      </w:r>
+      <w:r>
+        <w:rPr>
+          <w:rFonts w:ascii="Times New Roman" w:hAnsi="Times New Roman"/>
+          <w:color w:val="0066CC"/>
+          <w:sz w:val="22"/>
+          <w:u w:val="single"/>
+        </w:rPr>
+        <w:t>https://github.com/Pranavkotame/NPC-ASSIGNMENT-2.git</w:t>
+      </w:r>
+    </w:p>
     <w:sectPr>
       <w:pgSz w:w="12240" w:h="15840"/>
       <w:pgMar w:top="1008" w:right="1152" w:bottom="1008" w:left="1152" w:header="720" w:footer="720" w:gutter="0"/>

</xml_diff>

<commit_message>
Add Student Name and PRN to report header
</commit_message>
<xml_diff>
--- a/Protocol_Analysis_with_Wireshark_Report.docx
+++ b/Protocol_Analysis_with_Wireshark_Report.docx
@@ -37,7 +37,37 @@
         <w:t>Unit 2: Network Models and Protocols</w:t>
       </w:r>
     </w:p>
-    <w:p/>
+    <w:p>
+      <w:r/>
+      <w:r>
+        <w:rPr>
+          <w:b/>
+          <w:sz w:val="22"/>
+        </w:rPr>
+        <w:t xml:space="preserve">Student Name: </w:t>
+      </w:r>
+      <w:r>
+        <w:rPr>
+          <w:b w:val="0"/>
+          <w:sz w:val="22"/>
+        </w:rPr>
+        <w:t xml:space="preserve">Kotame Pranav    </w:t>
+      </w:r>
+      <w:r>
+        <w:rPr>
+          <w:b/>
+          <w:sz w:val="22"/>
+        </w:rPr>
+        <w:t xml:space="preserve">PRN: </w:t>
+      </w:r>
+      <w:r>
+        <w:rPr>
+          <w:b w:val="0"/>
+          <w:sz w:val="22"/>
+        </w:rPr>
+        <w:t>2125UCSM1061</w:t>
+      </w:r>
+    </w:p>
     <w:p>
       <w:r>
         <w:rPr>

</xml_diff>

<commit_message>
Update report and README matching Shubham's project structure with Pranav's credentials
</commit_message>
<xml_diff>
--- a/Protocol_Analysis_with_Wireshark_Report.docx
+++ b/Protocol_Analysis_with_Wireshark_Report.docx
@@ -37,37 +37,365 @@
         <w:t>Unit 2: Network Models and Protocols</w:t>
       </w:r>
     </w:p>
+    <w:tbl>
+      <w:tblPr>
+        <w:tblW w:type="auto" w:w="0"/>
+        <w:tblLook w:firstColumn="1" w:firstRow="1" w:lastColumn="0" w:lastRow="0" w:noHBand="0" w:noVBand="1" w:val="04A0"/>
+        <w:jc w:val="center"/>
+        <w:tblBorders>
+          <w:top w:val="single" w:sz="4" w:space="0" w:color="CCCCCC"/>
+          <w:bottom w:val="single" w:sz="4" w:space="0" w:color="CCCCCC"/>
+          <w:insideH w:val="single" w:sz="4" w:space="0" w:color="E5E5E5"/>
+          <w:insideV w:val="none"/>
+          <w:left w:val="none"/>
+          <w:right w:val="none"/>
+        </w:tblBorders>
+      </w:tblPr>
+      <w:tblGrid>
+        <w:gridCol w:w="4968"/>
+        <w:gridCol w:w="4968"/>
+      </w:tblGrid>
+      <w:tr>
+        <w:trPr>
+          <w:cantSplit/>
+          <w:cantSplit/>
+        </w:trPr>
+        <w:tc>
+          <w:tcPr>
+            <w:tcW w:type="dxa" w:w="4968"/>
+            <w:shd w:fill="F2F4F8"/>
+          </w:tcPr>
+          <w:p>
+            <w:pPr>
+              <w:spacing w:before="60" w:after="60" w:line="276" w:lineRule="auto"/>
+              <w:jc w:val="left"/>
+            </w:pPr>
+            <w:r/>
+            <w:r>
+              <w:rPr>
+                <w:rFonts w:ascii="Calibri" w:hAnsi="Calibri"/>
+                <w:b/>
+                <w:sz w:val="20"/>
+              </w:rPr>
+              <w:t>Student Name</w:t>
+            </w:r>
+          </w:p>
+        </w:tc>
+        <w:tc>
+          <w:tcPr>
+            <w:tcW w:type="dxa" w:w="4968"/>
+          </w:tcPr>
+          <w:p>
+            <w:pPr>
+              <w:spacing w:before="60" w:after="60" w:line="276" w:lineRule="auto"/>
+              <w:jc w:val="left"/>
+            </w:pPr>
+            <w:r/>
+            <w:r>
+              <w:rPr>
+                <w:rFonts w:ascii="Calibri" w:hAnsi="Calibri"/>
+                <w:b w:val="0"/>
+                <w:sz w:val="20"/>
+              </w:rPr>
+              <w:t>Kotame Pranav</w:t>
+            </w:r>
+          </w:p>
+        </w:tc>
+      </w:tr>
+      <w:tr>
+        <w:trPr>
+          <w:cantSplit/>
+          <w:cantSplit/>
+        </w:trPr>
+        <w:tc>
+          <w:tcPr>
+            <w:tcW w:type="dxa" w:w="4968"/>
+            <w:shd w:fill="F2F4F8"/>
+          </w:tcPr>
+          <w:p>
+            <w:pPr>
+              <w:spacing w:before="60" w:after="60" w:line="276" w:lineRule="auto"/>
+              <w:jc w:val="left"/>
+            </w:pPr>
+            <w:r/>
+            <w:r>
+              <w:rPr>
+                <w:rFonts w:ascii="Calibri" w:hAnsi="Calibri"/>
+                <w:b/>
+                <w:sz w:val="20"/>
+              </w:rPr>
+              <w:t>PRN</w:t>
+            </w:r>
+          </w:p>
+        </w:tc>
+        <w:tc>
+          <w:tcPr>
+            <w:tcW w:type="dxa" w:w="4968"/>
+          </w:tcPr>
+          <w:p>
+            <w:pPr>
+              <w:spacing w:before="60" w:after="60" w:line="276" w:lineRule="auto"/>
+              <w:jc w:val="left"/>
+            </w:pPr>
+            <w:r/>
+            <w:r>
+              <w:rPr>
+                <w:rFonts w:ascii="Calibri" w:hAnsi="Calibri"/>
+                <w:b w:val="0"/>
+                <w:sz w:val="20"/>
+              </w:rPr>
+              <w:t>2125UCSM1061</w:t>
+            </w:r>
+          </w:p>
+        </w:tc>
+      </w:tr>
+      <w:tr>
+        <w:trPr>
+          <w:cantSplit/>
+          <w:cantSplit/>
+        </w:trPr>
+        <w:tc>
+          <w:tcPr>
+            <w:tcW w:type="dxa" w:w="4968"/>
+            <w:shd w:fill="F2F4F8"/>
+          </w:tcPr>
+          <w:p>
+            <w:pPr>
+              <w:spacing w:before="60" w:after="60" w:line="276" w:lineRule="auto"/>
+              <w:jc w:val="left"/>
+            </w:pPr>
+            <w:r/>
+            <w:r>
+              <w:rPr>
+                <w:rFonts w:ascii="Calibri" w:hAnsi="Calibri"/>
+                <w:b/>
+                <w:sz w:val="20"/>
+              </w:rPr>
+              <w:t>Course / Module</w:t>
+            </w:r>
+          </w:p>
+        </w:tc>
+        <w:tc>
+          <w:tcPr>
+            <w:tcW w:type="dxa" w:w="4968"/>
+          </w:tcPr>
+          <w:p>
+            <w:pPr>
+              <w:spacing w:before="60" w:after="60" w:line="276" w:lineRule="auto"/>
+              <w:jc w:val="left"/>
+            </w:pPr>
+            <w:r/>
+            <w:r>
+              <w:rPr>
+                <w:rFonts w:ascii="Calibri" w:hAnsi="Calibri"/>
+                <w:b w:val="0"/>
+                <w:sz w:val="20"/>
+              </w:rPr>
+              <w:t>Unit 2: Network Models and Protocols</w:t>
+            </w:r>
+          </w:p>
+        </w:tc>
+      </w:tr>
+      <w:tr>
+        <w:trPr>
+          <w:cantSplit/>
+          <w:cantSplit/>
+        </w:trPr>
+        <w:tc>
+          <w:tcPr>
+            <w:tcW w:type="dxa" w:w="4968"/>
+            <w:shd w:fill="F2F4F8"/>
+          </w:tcPr>
+          <w:p>
+            <w:pPr>
+              <w:spacing w:before="60" w:after="60" w:line="276" w:lineRule="auto"/>
+              <w:jc w:val="left"/>
+            </w:pPr>
+            <w:r/>
+            <w:r>
+              <w:rPr>
+                <w:rFonts w:ascii="Calibri" w:hAnsi="Calibri"/>
+                <w:b/>
+                <w:sz w:val="20"/>
+              </w:rPr>
+              <w:t>Project Title</w:t>
+            </w:r>
+          </w:p>
+        </w:tc>
+        <w:tc>
+          <w:tcPr>
+            <w:tcW w:type="dxa" w:w="4968"/>
+          </w:tcPr>
+          <w:p>
+            <w:pPr>
+              <w:spacing w:before="60" w:after="60" w:line="276" w:lineRule="auto"/>
+              <w:jc w:val="left"/>
+            </w:pPr>
+            <w:r/>
+            <w:r>
+              <w:rPr>
+                <w:rFonts w:ascii="Calibri" w:hAnsi="Calibri"/>
+                <w:b w:val="0"/>
+                <w:sz w:val="20"/>
+              </w:rPr>
+              <w:t>Protocol Analysis with Wireshark (NPC Assignment 2)</w:t>
+            </w:r>
+          </w:p>
+        </w:tc>
+      </w:tr>
+      <w:tr>
+        <w:trPr>
+          <w:cantSplit/>
+          <w:cantSplit/>
+        </w:trPr>
+        <w:tc>
+          <w:tcPr>
+            <w:tcW w:type="dxa" w:w="4968"/>
+            <w:shd w:fill="F2F4F8"/>
+          </w:tcPr>
+          <w:p>
+            <w:pPr>
+              <w:spacing w:before="60" w:after="60" w:line="276" w:lineRule="auto"/>
+              <w:jc w:val="left"/>
+            </w:pPr>
+            <w:r/>
+            <w:r>
+              <w:rPr>
+                <w:rFonts w:ascii="Calibri" w:hAnsi="Calibri"/>
+                <w:b/>
+                <w:sz w:val="20"/>
+              </w:rPr>
+              <w:t>Tools / Environment</w:t>
+            </w:r>
+          </w:p>
+        </w:tc>
+        <w:tc>
+          <w:tcPr>
+            <w:tcW w:type="dxa" w:w="4968"/>
+          </w:tcPr>
+          <w:p>
+            <w:pPr>
+              <w:spacing w:before="60" w:after="60" w:line="276" w:lineRule="auto"/>
+              <w:jc w:val="left"/>
+            </w:pPr>
+            <w:r/>
+            <w:r>
+              <w:rPr>
+                <w:rFonts w:ascii="Calibri" w:hAnsi="Calibri"/>
+                <w:b w:val="0"/>
+                <w:sz w:val="20"/>
+              </w:rPr>
+              <w:t>Wireshark (v4.x) on Kali Linux (eth0)</w:t>
+            </w:r>
+          </w:p>
+        </w:tc>
+      </w:tr>
+      <w:tr>
+        <w:trPr>
+          <w:cantSplit/>
+          <w:cantSplit/>
+        </w:trPr>
+        <w:tc>
+          <w:tcPr>
+            <w:tcW w:type="dxa" w:w="4968"/>
+            <w:shd w:fill="F2F4F8"/>
+          </w:tcPr>
+          <w:p>
+            <w:pPr>
+              <w:spacing w:before="60" w:after="60" w:line="276" w:lineRule="auto"/>
+              <w:jc w:val="left"/>
+            </w:pPr>
+            <w:r/>
+            <w:r>
+              <w:rPr>
+                <w:rFonts w:ascii="Calibri" w:hAnsi="Calibri"/>
+                <w:b/>
+                <w:sz w:val="20"/>
+              </w:rPr>
+              <w:t>GitHub Repository</w:t>
+            </w:r>
+          </w:p>
+        </w:tc>
+        <w:tc>
+          <w:tcPr>
+            <w:tcW w:type="dxa" w:w="4968"/>
+          </w:tcPr>
+          <w:p>
+            <w:pPr>
+              <w:spacing w:before="60" w:after="60" w:line="276" w:lineRule="auto"/>
+              <w:jc w:val="left"/>
+            </w:pPr>
+            <w:r/>
+            <w:r>
+              <w:rPr>
+                <w:rFonts w:ascii="Calibri" w:hAnsi="Calibri"/>
+                <w:b w:val="0"/>
+                <w:sz w:val="20"/>
+              </w:rPr>
+              <w:t>NPC-ASSIGNMENT-2</w:t>
+            </w:r>
+          </w:p>
+        </w:tc>
+      </w:tr>
+      <w:tr>
+        <w:trPr>
+          <w:cantSplit/>
+          <w:cantSplit/>
+        </w:trPr>
+        <w:tc>
+          <w:tcPr>
+            <w:tcW w:type="dxa" w:w="4968"/>
+            <w:shd w:fill="F2F4F8"/>
+          </w:tcPr>
+          <w:p>
+            <w:pPr>
+              <w:spacing w:before="60" w:after="60" w:line="276" w:lineRule="auto"/>
+              <w:jc w:val="left"/>
+            </w:pPr>
+            <w:r/>
+            <w:r>
+              <w:rPr>
+                <w:rFonts w:ascii="Calibri" w:hAnsi="Calibri"/>
+                <w:b/>
+                <w:sz w:val="20"/>
+              </w:rPr>
+              <w:t>GitHub Link</w:t>
+            </w:r>
+          </w:p>
+        </w:tc>
+        <w:tc>
+          <w:tcPr>
+            <w:tcW w:type="dxa" w:w="4968"/>
+          </w:tcPr>
+          <w:p>
+            <w:pPr>
+              <w:spacing w:before="60" w:after="60"/>
+            </w:pPr>
+            <w:r/>
+            <w:hyperlink r:id="rId11">
+              <w:r>
+                <w:rPr>
+                  <w:rFonts w:ascii="Calibri" w:hAnsi="Calibri"/>
+                  <w:color w:val="0000FF"/>
+                  <w:u w:val="single"/>
+                  <w:sz w:val="19"/>
+                </w:rPr>
+                <w:t>https://github.com/Pranavkotame/NPC-ASSIGNMENT-2</w:t>
+              </w:r>
+            </w:hyperlink>
+          </w:p>
+        </w:tc>
+      </w:tr>
+    </w:tbl>
     <w:p>
-      <w:r/>
+      <w:pPr>
+        <w:spacing w:before="240"/>
+      </w:pPr>
       <w:r>
-        <w:rPr>
-          <w:b/>
-          <w:sz w:val="22"/>
-        </w:rPr>
-        <w:t xml:space="preserve">Student Name: </w:t>
-      </w:r>
-      <w:r>
-        <w:rPr>
-          <w:b w:val="0"/>
-          <w:sz w:val="22"/>
-        </w:rPr>
-        <w:t xml:space="preserve">Kotame Pranav    </w:t>
-      </w:r>
-      <w:r>
-        <w:rPr>
-          <w:b/>
-          <w:sz w:val="22"/>
-        </w:rPr>
-        <w:t xml:space="preserve">PRN: </w:t>
-      </w:r>
-      <w:r>
-        <w:rPr>
-          <w:b w:val="0"/>
-          <w:sz w:val="22"/>
-        </w:rPr>
-        <w:t>2125UCSM1061</w:t>
+        <w:br w:type="page"/>
       </w:r>
     </w:p>
+    <w:p/>
     <w:p>
       <w:r>
         <w:rPr>
@@ -242,6 +570,9 @@
         <w:gridCol w:w="1656"/>
       </w:tblGrid>
       <w:tr>
+        <w:trPr>
+          <w:cantSplit/>
+        </w:trPr>
         <w:tc>
           <w:tcPr>
             <w:tcW w:type="dxa" w:w="1656"/>
@@ -322,6 +653,9 @@
         </w:tc>
       </w:tr>
       <w:tr>
+        <w:trPr>
+          <w:cantSplit/>
+        </w:trPr>
         <w:tc>
           <w:tcPr>
             <w:tcW w:type="dxa" w:w="1656"/>
@@ -384,6 +718,9 @@
         </w:tc>
       </w:tr>
       <w:tr>
+        <w:trPr>
+          <w:cantSplit/>
+        </w:trPr>
         <w:tc>
           <w:tcPr>
             <w:tcW w:type="dxa" w:w="1656"/>
@@ -446,6 +783,9 @@
         </w:tc>
       </w:tr>
       <w:tr>
+        <w:trPr>
+          <w:cantSplit/>
+        </w:trPr>
         <w:tc>
           <w:tcPr>
             <w:tcW w:type="dxa" w:w="1656"/>
@@ -550,6 +890,9 @@
         <w:gridCol w:w="1987"/>
       </w:tblGrid>
       <w:tr>
+        <w:trPr>
+          <w:cantSplit/>
+        </w:trPr>
         <w:tc>
           <w:tcPr>
             <w:tcW w:type="dxa" w:w="1987"/>
@@ -617,6 +960,9 @@
         </w:tc>
       </w:tr>
       <w:tr>
+        <w:trPr>
+          <w:cantSplit/>
+        </w:trPr>
         <w:tc>
           <w:tcPr>
             <w:tcW w:type="dxa" w:w="1987"/>
@@ -810,32 +1156,127 @@
       </w:r>
     </w:p>
     <w:p>
+      <w:pPr>
+        <w:spacing w:before="280" w:after="120"/>
+      </w:pPr>
       <w:r>
         <w:rPr>
-          <w:rFonts w:ascii="Times New Roman" w:hAnsi="Times New Roman"/>
+          <w:rFonts w:ascii="Calibri" w:hAnsi="Calibri"/>
           <w:b/>
-          <w:sz w:val="24"/>
+          <w:sz w:val="26"/>
         </w:rPr>
-        <w:t>10. GitHub Repository Link</w:t>
+        <w:t>10. Submission Evidence Checklist</w:t>
       </w:r>
     </w:p>
     <w:p>
+      <w:pPr>
+        <w:pStyle w:val="ListBullet"/>
+        <w:spacing w:before="40" w:after="40"/>
+      </w:pPr>
       <w:r>
         <w:rPr>
-          <w:rFonts w:ascii="Times New Roman" w:hAnsi="Times New Roman"/>
+          <w:rFonts w:ascii="Segoe UI Symbol" w:hAnsi="Segoe UI Symbol"/>
           <w:sz w:val="22"/>
         </w:rPr>
-        <w:t>The project report, Wireshark packet capture file (.pcapng), and screenshots are available on GitHub at:</w:t>
-        <w:br/>
+        <w:t>✓</w:t>
       </w:r>
       <w:r>
         <w:rPr>
-          <w:rFonts w:ascii="Times New Roman" w:hAnsi="Times New Roman"/>
-          <w:color w:val="0066CC"/>
+          <w:rFonts w:ascii="Calibri" w:hAnsi="Calibri"/>
           <w:sz w:val="22"/>
-          <w:u w:val="single"/>
         </w:rPr>
-        <w:t>https://github.com/Pranavkotame/NPC-ASSIGNMENT-2.git</w:t>
+        <w:t xml:space="preserve"> GitHub Repository: </w:t>
+      </w:r>
+      <w:hyperlink r:id="rId11">
+        <w:r>
+          <w:rPr>
+            <w:rFonts w:ascii="Calibri" w:hAnsi="Calibri"/>
+            <w:color w:val="0000FF"/>
+            <w:u w:val="single"/>
+            <w:sz w:val="21"/>
+          </w:rPr>
+          <w:t>https://github.com/Pranavkotame/NPC-ASSIGNMENT-2</w:t>
+        </w:r>
+      </w:hyperlink>
+    </w:p>
+    <w:p>
+      <w:pPr>
+        <w:pStyle w:val="ListBullet"/>
+        <w:spacing w:before="40" w:after="40"/>
+      </w:pPr>
+      <w:r>
+        <w:rPr>
+          <w:rFonts w:ascii="Segoe UI Symbol" w:hAnsi="Segoe UI Symbol"/>
+          <w:sz w:val="22"/>
+        </w:rPr>
+        <w:t>✓</w:t>
+      </w:r>
+      <w:r>
+        <w:rPr>
+          <w:rFonts w:ascii="Calibri" w:hAnsi="Calibri"/>
+          <w:sz w:val="22"/>
+        </w:rPr>
+        <w:t xml:space="preserve"> Wireshark Packet Capture file: protocol_analysis.pcapng</w:t>
+      </w:r>
+    </w:p>
+    <w:p>
+      <w:pPr>
+        <w:pStyle w:val="ListBullet"/>
+        <w:spacing w:before="40" w:after="40"/>
+      </w:pPr>
+      <w:r>
+        <w:rPr>
+          <w:rFonts w:ascii="Segoe UI Symbol" w:hAnsi="Segoe UI Symbol"/>
+          <w:sz w:val="22"/>
+        </w:rPr>
+        <w:t>✓</w:t>
+      </w:r>
+      <w:r>
+        <w:rPr>
+          <w:rFonts w:ascii="Calibri" w:hAnsi="Calibri"/>
+          <w:sz w:val="22"/>
+        </w:rPr>
+        <w:t xml:space="preserve"> TCP Handshake Screenshot: Figure_1_TCP_Handshake.png</w:t>
+      </w:r>
+    </w:p>
+    <w:p>
+      <w:pPr>
+        <w:pStyle w:val="ListBullet"/>
+        <w:spacing w:before="40" w:after="40"/>
+      </w:pPr>
+      <w:r>
+        <w:rPr>
+          <w:rFonts w:ascii="Segoe UI Symbol" w:hAnsi="Segoe UI Symbol"/>
+          <w:sz w:val="22"/>
+        </w:rPr>
+        <w:t>✓</w:t>
+      </w:r>
+      <w:r>
+        <w:rPr>
+          <w:rFonts w:ascii="Calibri" w:hAnsi="Calibri"/>
+          <w:sz w:val="22"/>
+        </w:rPr>
+        <w:t xml:space="preserve"> HTTP Traffic Screenshot: Figure_2_HTTP_Traffic.png</w:t>
+      </w:r>
+    </w:p>
+    <w:p>
+      <w:pPr>
+        <w:pStyle w:val="ListBullet"/>
+        <w:spacing w:before="40" w:after="40"/>
+      </w:pPr>
+      <w:r>
+        <w:rPr>
+          <w:rFonts w:ascii="Segoe UI Symbol" w:hAnsi="Segoe UI Symbol"/>
+          <w:sz w:val="22"/>
+        </w:rPr>
+        <w:t>✓</w:t>
+      </w:r>
+      <w:r>
+        <w:rPr>
+          <w:rFonts w:ascii="Calibri" w:hAnsi="Calibri"/>
+          <w:sz w:val="22"/>
+        </w:rPr>
+        <w:t xml:space="preserve"> Project Documentation Report: Protocol_Analysis_with_Wireshark_Report.docx &amp; PDF</w:t>
       </w:r>
     </w:p>
     <w:sectPr>

</xml_diff>